<commit_message>
Started putting together basic stuff
Added some hierarchal sheets to the document. Begun adding basic things to the MCU sheet.
</commit_message>
<xml_diff>
--- a/docs/FHR-VCM-SYS-DES-001_VCM_System_Description.docx
+++ b/docs/FHR-VCM-SYS-DES-001_VCM_System_Description.docx
@@ -95,8 +95,14 @@
           <w:ilvl w:val="0"/>
           <w:numId w:val="1"/>
         </w:numPr>
-      </w:pPr>
-      <w:r>
+        <w:rPr>
+          <w:color w:val="00B050"/>
+        </w:rPr>
+      </w:pPr>
+      <w:r>
+        <w:rPr>
+          <w:color w:val="00B050"/>
+        </w:rPr>
         <w:t>Use an STM32F767ZITx microcontroller.</w:t>
       </w:r>
     </w:p>
@@ -107,8 +113,14 @@
           <w:ilvl w:val="0"/>
           <w:numId w:val="1"/>
         </w:numPr>
-      </w:pPr>
-      <w:r>
+        <w:rPr>
+          <w:color w:val="00B050"/>
+        </w:rPr>
+      </w:pPr>
+      <w:r>
+        <w:rPr>
+          <w:color w:val="00B050"/>
+        </w:rPr>
         <w:t>Receive vehicle data through CAN.</w:t>
       </w:r>
     </w:p>
@@ -119,8 +131,14 @@
           <w:ilvl w:val="0"/>
           <w:numId w:val="1"/>
         </w:numPr>
-      </w:pPr>
-      <w:r>
+        <w:rPr>
+          <w:color w:val="00B050"/>
+        </w:rPr>
+      </w:pPr>
+      <w:r>
+        <w:rPr>
+          <w:color w:val="00B050"/>
+        </w:rPr>
         <w:t>Use two CAN buses:</w:t>
       </w:r>
     </w:p>
@@ -131,8 +149,14 @@
           <w:ilvl w:val="1"/>
           <w:numId w:val="1"/>
         </w:numPr>
-      </w:pPr>
-      <w:r>
+        <w:rPr>
+          <w:color w:val="00B050"/>
+        </w:rPr>
+      </w:pPr>
+      <w:r>
+        <w:rPr>
+          <w:color w:val="00B050"/>
+        </w:rPr>
         <w:t>Primary CAN bus</w:t>
       </w:r>
     </w:p>
@@ -143,8 +167,14 @@
           <w:ilvl w:val="1"/>
           <w:numId w:val="1"/>
         </w:numPr>
-      </w:pPr>
-      <w:r>
+        <w:rPr>
+          <w:color w:val="00B050"/>
+        </w:rPr>
+      </w:pPr>
+      <w:r>
+        <w:rPr>
+          <w:color w:val="00B050"/>
+        </w:rPr>
         <w:t>Standby or backup CAN bus</w:t>
       </w:r>
     </w:p>
@@ -155,8 +185,14 @@
           <w:ilvl w:val="1"/>
           <w:numId w:val="1"/>
         </w:numPr>
-      </w:pPr>
-      <w:r>
+        <w:rPr>
+          <w:color w:val="00B050"/>
+        </w:rPr>
+      </w:pPr>
+      <w:r>
+        <w:rPr>
+          <w:color w:val="00B050"/>
+        </w:rPr>
         <w:t>Automatically use the backup CAN bus if the primary bus fails.</w:t>
       </w:r>
     </w:p>
@@ -167,8 +203,14 @@
           <w:ilvl w:val="1"/>
           <w:numId w:val="1"/>
         </w:numPr>
-      </w:pPr>
-      <w:r>
+        <w:rPr>
+          <w:color w:val="00B050"/>
+        </w:rPr>
+      </w:pPr>
+      <w:r>
+        <w:rPr>
+          <w:color w:val="00B050"/>
+        </w:rPr>
         <w:t>Send a CAN keep-alive message.</w:t>
       </w:r>
     </w:p>
@@ -179,8 +221,14 @@
           <w:ilvl w:val="0"/>
           <w:numId w:val="1"/>
         </w:numPr>
-      </w:pPr>
-      <w:r>
+        <w:rPr>
+          <w:color w:val="FFFF00"/>
+        </w:rPr>
+      </w:pPr>
+      <w:r>
+        <w:rPr>
+          <w:color w:val="FFFF00"/>
+        </w:rPr>
         <w:t>Monitor vehicle information such as:</w:t>
       </w:r>
     </w:p>
@@ -191,8 +239,14 @@
           <w:ilvl w:val="1"/>
           <w:numId w:val="1"/>
         </w:numPr>
-      </w:pPr>
-      <w:r>
+        <w:rPr>
+          <w:color w:val="FFFF00"/>
+        </w:rPr>
+      </w:pPr>
+      <w:r>
+        <w:rPr>
+          <w:color w:val="FFFF00"/>
+        </w:rPr>
         <w:t>Electric motor temperatures</w:t>
       </w:r>
     </w:p>
@@ -203,8 +257,14 @@
           <w:ilvl w:val="1"/>
           <w:numId w:val="1"/>
         </w:numPr>
-      </w:pPr>
-      <w:r>
+        <w:rPr>
+          <w:color w:val="FFFF00"/>
+        </w:rPr>
+      </w:pPr>
+      <w:r>
+        <w:rPr>
+          <w:color w:val="FFFF00"/>
+        </w:rPr>
         <w:t>Brake-related information</w:t>
       </w:r>
     </w:p>
@@ -215,8 +275,14 @@
           <w:ilvl w:val="1"/>
           <w:numId w:val="1"/>
         </w:numPr>
-      </w:pPr>
-      <w:r>
+        <w:rPr>
+          <w:color w:val="FFFF00"/>
+        </w:rPr>
+      </w:pPr>
+      <w:r>
+        <w:rPr>
+          <w:color w:val="FFFF00"/>
+        </w:rPr>
         <w:t>Accelerator-pedal position</w:t>
       </w:r>
     </w:p>
@@ -227,8 +293,14 @@
           <w:ilvl w:val="1"/>
           <w:numId w:val="1"/>
         </w:numPr>
-      </w:pPr>
-      <w:r>
+        <w:rPr>
+          <w:color w:val="FFFF00"/>
+        </w:rPr>
+      </w:pPr>
+      <w:r>
+        <w:rPr>
+          <w:color w:val="FFFF00"/>
+        </w:rPr>
         <w:t>Additional vehicle data to be determined</w:t>
       </w:r>
     </w:p>
@@ -239,8 +311,14 @@
           <w:ilvl w:val="0"/>
           <w:numId w:val="1"/>
         </w:numPr>
-      </w:pPr>
-      <w:r>
+        <w:rPr>
+          <w:color w:val="FFFF00"/>
+        </w:rPr>
+      </w:pPr>
+      <w:r>
+        <w:rPr>
+          <w:color w:val="FFFF00"/>
+        </w:rPr>
         <w:t>Communicate with other vehicle systems or devices.</w:t>
       </w:r>
     </w:p>
@@ -251,8 +329,14 @@
           <w:ilvl w:val="0"/>
           <w:numId w:val="1"/>
         </w:numPr>
-      </w:pPr>
-      <w:r>
+        <w:rPr>
+          <w:color w:val="00B050"/>
+        </w:rPr>
+      </w:pPr>
+      <w:r>
+        <w:rPr>
+          <w:color w:val="00B050"/>
+        </w:rPr>
         <w:t>Use USB-C to connect to a computer for firmware updates and possibly data transfer.</w:t>
       </w:r>
     </w:p>
@@ -263,8 +347,14 @@
           <w:ilvl w:val="0"/>
           <w:numId w:val="1"/>
         </w:numPr>
-      </w:pPr>
-      <w:r>
+        <w:rPr>
+          <w:color w:val="FFFF00"/>
+        </w:rPr>
+      </w:pPr>
+      <w:r>
+        <w:rPr>
+          <w:color w:val="FFFF00"/>
+        </w:rPr>
         <w:t>Potentially record vehicle data to a removable microSD card.</w:t>
       </w:r>
     </w:p>

</xml_diff>